<commit_message>
Remove nota do professor do exemplo de Diagnóstico DevOps
Arquivo pronto para ser projetado em sala como está.

Co-Authored-By: Claude Sonnet 5 <noreply@anthropic.com>
</commit_message>
<xml_diff>
--- a/Práticas/Exemplo Preenchido - Diagnóstico DevOps (Atividade 1).docx
+++ b/Práticas/Exemplo Preenchido - Diagnóstico DevOps (Atividade 1).docx
@@ -13,33 +13,15 @@
       </w:r>
     </w:p>
     <w:p>
+      <w:pPr>
+        <w:spacing w:after="320"/>
+      </w:pPr>
       <w:r>
         <w:rPr>
           <w:color w:val="555555"/>
           <w:sz w:val="21"/>
         </w:rPr>
         <w:t>Desenvolvimento de Software Integrado — DevOps | PG2305-04-Z251 | Turma 4 - Z251 | 2026.2</w:t>
-      </w:r>
-    </w:p>
-    <w:p>
-      <w:pPr>
-        <w:shd w:val="clear" w:color="auto" w:fill="FFF7E6"/>
-        <w:pBdr>
-          <w:left w:val="single" w:sz="18" w:space="8" w:color="C08A1E"/>
-        </w:pBdr>
-        <w:spacing w:before="200" w:after="280"/>
-      </w:pPr>
-      <w:r>
-        <w:rPr>
-          <w:b/>
-        </w:rPr>
-        <w:t xml:space="preserve">Nota para o professor (remova este bloco antes de projetar): </w:t>
-      </w:r>
-      <w:r>
-        <w:rPr>
-          <w:i/>
-        </w:rPr>
-        <w:t>cenário fictício, criado só para calibrar o nível de detalhe esperado — não é baseado em nenhuma empresa real. Sugestão de uso em sala: deixe os grupos tentarem sozinhos primeiro (passos 1-3 da Atividade 1) e só mostre este exemplo no fechamento, como comparação — se mostrar antes, os grupos tendem a copiar a estrutura em vez de pensar no próprio fluxo (efeito de ancoragem). Bom também para mostrar o que NÃO conta como gargalo específico o suficiente: "sistema lento" é vago; "deploy manual via FTP direto em produção, sem revisão" é um gargalo de verdade porque já aponta pra uma causa e uma automação possível.</w:t>
       </w:r>
     </w:p>
     <w:p>

</xml_diff>

<commit_message>
Adiciona classificação de categoria aos gargalos do exemplo preenchido
Cada gargalo passa a indicar sua categoria (cultura, processo ou
ferramenta/dado), como pede o Passo 2 da Atividade 1 — os três
gargalos do exemplo cobrem as três categorias. A melhoria escolhida
também ganha sua classificação.

Co-Authored-By: Claude Sonnet 5 <noreply@anthropic.com>
</commit_message>
<xml_diff>
--- a/Práticas/Exemplo Preenchido - Diagnóstico DevOps (Atividade 1).docx
+++ b/Práticas/Exemplo Preenchido - Diagnóstico DevOps (Atividade 1).docx
@@ -105,7 +105,21 @@
         <w:pStyle w:val="ListBullet"/>
       </w:pPr>
       <w:r>
-        <w:t>Gargalo 1 — Deploy manual sem pipeline nem revisão. Qualquer erro de digitação vira incidente em produção sem ninguém perceber antes.</w:t>
+        <w:t xml:space="preserve">Gargalo 1 — Deploy manual sem pipeline nem revisão. Qualquer erro de digitação vira incidente em produção sem ninguém perceber antes.  </w:t>
+      </w:r>
+      <w:r>
+        <w:rPr>
+          <w:b/>
+          <w:color w:val="2A5C8A"/>
+          <w:sz w:val="19"/>
+        </w:rPr>
+        <w:t>Categoria: processo</w:t>
+      </w:r>
+      <w:r>
+        <w:rPr>
+          <w:i/>
+        </w:rPr>
+        <w:t xml:space="preserve">  — não existe uma etapa formal de revisão/aprovação antes do deploy.</w:t>
       </w:r>
     </w:p>
     <w:p>
@@ -113,7 +127,21 @@
         <w:pStyle w:val="ListBullet"/>
       </w:pPr>
       <w:r>
-        <w:t>Gargalo 2 — Nenhum teste automatizado. Bugs só aparecem depois que o cliente já viu, nunca antes do deploy.</w:t>
+        <w:t xml:space="preserve">Gargalo 2 — Nenhum teste automatizado. Bugs só aparecem depois que o cliente já viu, nunca antes do deploy.  </w:t>
+      </w:r>
+      <w:r>
+        <w:rPr>
+          <w:b/>
+          <w:color w:val="B03A2E"/>
+          <w:sz w:val="19"/>
+        </w:rPr>
+        <w:t>Categoria: ferramenta/dado</w:t>
+      </w:r>
+      <w:r>
+        <w:rPr>
+          <w:i/>
+        </w:rPr>
+        <w:t xml:space="preserve">  — falta uma ferramenta de CI que rode testes automaticamente.</w:t>
       </w:r>
     </w:p>
     <w:p>
@@ -121,7 +149,21 @@
         <w:pStyle w:val="ListBullet"/>
       </w:pPr>
       <w:r>
-        <w:t>Gargalo 3 — Nenhuma rastreabilidade. Ninguém sabe o que mudou entre uma versão e outra, nem quem fez o quê.</w:t>
+        <w:t xml:space="preserve">Gargalo 3 — Nenhuma rastreabilidade. Ninguém sabe o que mudou entre uma versão e outra, nem quem fez o quê.  </w:t>
+      </w:r>
+      <w:r>
+        <w:rPr>
+          <w:b/>
+          <w:color w:val="1E7A34"/>
+          <w:sz w:val="19"/>
+        </w:rPr>
+        <w:t>Categoria: cultura</w:t>
+      </w:r>
+      <w:r>
+        <w:rPr>
+          <w:i/>
+        </w:rPr>
+        <w:t xml:space="preserve">  — ninguém se sente dono de registrar as mudanças; não é falta de ferramenta, é falta de hábito compartilhado.</w:t>
       </w:r>
     </w:p>
     <w:p>
@@ -142,6 +184,37 @@
       </w:r>
       <w:r>
         <w:t>Implementar um pipeline de CI simples que roda testes automatizados a cada push e bloqueia o deploy se algo quebrar, junto com um fluxo mínimo de Pull Request antes de qualquer alteração ir para produção.</w:t>
+      </w:r>
+    </w:p>
+    <w:p>
+      <w:r>
+        <w:rPr>
+          <w:b/>
+          <w:color w:val="1B2A4A"/>
+        </w:rPr>
+        <w:t xml:space="preserve">Categoria da melhoria: </w:t>
+      </w:r>
+      <w:r>
+        <w:rPr>
+          <w:b/>
+          <w:color w:val="B03A2E"/>
+          <w:sz w:val="19"/>
+        </w:rPr>
+        <w:t>ferramenta/dado</w:t>
+      </w:r>
+      <w:r>
+        <w:rPr>
+          <w:b/>
+          <w:color w:val="2A5C8A"/>
+          <w:sz w:val="19"/>
+        </w:rPr>
+        <w:t xml:space="preserve"> processo</w:t>
+      </w:r>
+      <w:r>
+        <w:rPr>
+          <w:i/>
+        </w:rPr>
+        <w:t xml:space="preserve">  — a automação exige também o hábito de abrir Pull Request antes de qualquer mudança.</w:t>
       </w:r>
     </w:p>
     <w:p>

</xml_diff>